<commit_message>
Refresh generated Bupa Antofagasta final Word/PDF and charts.
Co-authored-by: anibaloperacionesWes <anibaloperacionesWes@users.noreply.github.com>
</commit_message>
<xml_diff>
--- a/reports/Bupa_Antofagasta/INFORME_FINAL/Informe_final_WES_Bupa_Antofagasta_20260723_20261011.docx
+++ b/reports/Bupa_Antofagasta/INFORME_FINAL/Informe_final_WES_Bupa_Antofagasta_20260723_20261011.docx
@@ -1040,221 +1040,257 @@
         <w:t>Entre el 20 y 21 de julio se ejecutaron trabajos de instalación de equipos WES de Monitoreo Inteligente. A continuación, fotografías de los puntos instrumentados (fuente: Bupa Antofagasta / Fotografias).</w:t>
       </w:r>
     </w:p>
+    <w:tbl>
+      <w:tblPr>
+        <w:tblW w:type="auto" w:w="0"/>
+        <w:jc w:val="center"/>
+        <w:tblLook w:firstColumn="1" w:firstRow="1" w:lastColumn="0" w:lastRow="0" w:noHBand="0" w:noVBand="1" w:val="04A0"/>
+      </w:tblPr>
+      <w:tblGrid>
+        <w:gridCol w:w="4896"/>
+        <w:gridCol w:w="4896"/>
+      </w:tblGrid>
+      <w:tr>
+        <w:tc>
+          <w:tcPr>
+            <w:tcW w:type="dxa" w:w="4896"/>
+          </w:tcPr>
+          <w:p>
+            <w:pPr>
+              <w:jc w:val="center"/>
+            </w:pPr>
+            <w:r/>
+            <w:r>
+              <w:drawing>
+                <wp:inline xmlns:a="http://schemas.openxmlformats.org/drawingml/2006/main" xmlns:pic="http://schemas.openxmlformats.org/drawingml/2006/picture">
+                  <wp:extent cx="2606040" cy="3474720"/>
+                  <wp:docPr id="1" name="Picture 1"/>
+                  <wp:cNvGraphicFramePr>
+                    <a:graphicFrameLocks noChangeAspect="1"/>
+                  </wp:cNvGraphicFramePr>
+                  <a:graphic>
+                    <a:graphicData uri="http://schemas.openxmlformats.org/drawingml/2006/picture">
+                      <pic:pic>
+                        <pic:nvPicPr>
+                          <pic:cNvPr id="0" name="Matriz Sanitaria.jpeg"/>
+                          <pic:cNvPicPr/>
+                        </pic:nvPicPr>
+                        <pic:blipFill>
+                          <a:blip r:embed="rId9"/>
+                          <a:stretch>
+                            <a:fillRect/>
+                          </a:stretch>
+                        </pic:blipFill>
+                        <pic:spPr>
+                          <a:xfrm>
+                            <a:off x="0" y="0"/>
+                            <a:ext cx="2606040" cy="3474720"/>
+                          </a:xfrm>
+                          <a:prstGeom prst="rect"/>
+                        </pic:spPr>
+                      </pic:pic>
+                    </a:graphicData>
+                  </a:graphic>
+                </wp:inline>
+              </w:drawing>
+            </w:r>
+          </w:p>
+          <w:p>
+            <w:pPr>
+              <w:jc w:val="center"/>
+            </w:pPr>
+            <w:r>
+              <w:rPr>
+                <w:b w:val="0"/>
+                <w:color w:val="505050"/>
+                <w:sz w:val="14"/>
+              </w:rPr>
+              <w:t>Medidor Principal Sanitaria — matriz de entrada</w:t>
+            </w:r>
+          </w:p>
+        </w:tc>
+        <w:tc>
+          <w:tcPr>
+            <w:tcW w:type="dxa" w:w="4896"/>
+          </w:tcPr>
+          <w:p>
+            <w:pPr>
+              <w:jc w:val="center"/>
+            </w:pPr>
+            <w:r/>
+            <w:r>
+              <w:drawing>
+                <wp:inline xmlns:a="http://schemas.openxmlformats.org/drawingml/2006/main" xmlns:pic="http://schemas.openxmlformats.org/drawingml/2006/picture">
+                  <wp:extent cx="2606040" cy="3474720"/>
+                  <wp:docPr id="2" name="Picture 2"/>
+                  <wp:cNvGraphicFramePr>
+                    <a:graphicFrameLocks noChangeAspect="1"/>
+                  </wp:cNvGraphicFramePr>
+                  <a:graphic>
+                    <a:graphicData uri="http://schemas.openxmlformats.org/drawingml/2006/picture">
+                      <pic:pic>
+                        <pic:nvPicPr>
+                          <pic:cNvPr id="0" name="Sala de bomba matriz principal.jpeg"/>
+                          <pic:cNvPicPr/>
+                        </pic:nvPicPr>
+                        <pic:blipFill>
+                          <a:blip r:embed="rId10"/>
+                          <a:stretch>
+                            <a:fillRect/>
+                          </a:stretch>
+                        </pic:blipFill>
+                        <pic:spPr>
+                          <a:xfrm>
+                            <a:off x="0" y="0"/>
+                            <a:ext cx="2606040" cy="3474720"/>
+                          </a:xfrm>
+                          <a:prstGeom prst="rect"/>
+                        </pic:spPr>
+                      </pic:pic>
+                    </a:graphicData>
+                  </a:graphic>
+                </wp:inline>
+              </w:drawing>
+            </w:r>
+          </w:p>
+          <w:p>
+            <w:pPr>
+              <w:jc w:val="center"/>
+            </w:pPr>
+            <w:r>
+              <w:rPr>
+                <w:b w:val="0"/>
+                <w:color w:val="505050"/>
+                <w:sz w:val="14"/>
+              </w:rPr>
+              <w:t>Sala de Bomba Principal (1er piso)</w:t>
+            </w:r>
+          </w:p>
+        </w:tc>
+      </w:tr>
+      <w:tr>
+        <w:tc>
+          <w:tcPr>
+            <w:tcW w:type="dxa" w:w="4896"/>
+          </w:tcPr>
+          <w:p>
+            <w:pPr>
+              <w:jc w:val="center"/>
+            </w:pPr>
+            <w:r/>
+            <w:r>
+              <w:drawing>
+                <wp:inline xmlns:a="http://schemas.openxmlformats.org/drawingml/2006/main" xmlns:pic="http://schemas.openxmlformats.org/drawingml/2006/picture">
+                  <wp:extent cx="2606040" cy="3474720"/>
+                  <wp:docPr id="3" name="Picture 3"/>
+                  <wp:cNvGraphicFramePr>
+                    <a:graphicFrameLocks noChangeAspect="1"/>
+                  </wp:cNvGraphicFramePr>
+                  <a:graphic>
+                    <a:graphicData uri="http://schemas.openxmlformats.org/drawingml/2006/picture">
+                      <pic:pic>
+                        <pic:nvPicPr>
+                          <pic:cNvPr id="0" name="Sala de bomna N°2.jpeg"/>
+                          <pic:cNvPicPr/>
+                        </pic:nvPicPr>
+                        <pic:blipFill>
+                          <a:blip r:embed="rId11"/>
+                          <a:stretch>
+                            <a:fillRect/>
+                          </a:stretch>
+                        </pic:blipFill>
+                        <pic:spPr>
+                          <a:xfrm>
+                            <a:off x="0" y="0"/>
+                            <a:ext cx="2606040" cy="3474720"/>
+                          </a:xfrm>
+                          <a:prstGeom prst="rect"/>
+                        </pic:spPr>
+                      </pic:pic>
+                    </a:graphicData>
+                  </a:graphic>
+                </wp:inline>
+              </w:drawing>
+            </w:r>
+          </w:p>
+          <w:p>
+            <w:pPr>
+              <w:jc w:val="center"/>
+            </w:pPr>
+            <w:r>
+              <w:rPr>
+                <w:b w:val="0"/>
+                <w:color w:val="505050"/>
+                <w:sz w:val="14"/>
+              </w:rPr>
+              <w:t>Sala de Bomba N°2 (1er piso)</w:t>
+            </w:r>
+          </w:p>
+        </w:tc>
+        <w:tc>
+          <w:tcPr>
+            <w:tcW w:type="dxa" w:w="4896"/>
+          </w:tcPr>
+          <w:p>
+            <w:pPr>
+              <w:jc w:val="center"/>
+            </w:pPr>
+            <w:r/>
+            <w:r>
+              <w:drawing>
+                <wp:inline xmlns:a="http://schemas.openxmlformats.org/drawingml/2006/main" xmlns:pic="http://schemas.openxmlformats.org/drawingml/2006/picture">
+                  <wp:extent cx="2606040" cy="3474720"/>
+                  <wp:docPr id="4" name="Picture 4"/>
+                  <wp:cNvGraphicFramePr>
+                    <a:graphicFrameLocks noChangeAspect="1"/>
+                  </wp:cNvGraphicFramePr>
+                  <a:graphic>
+                    <a:graphicData uri="http://schemas.openxmlformats.org/drawingml/2006/picture">
+                      <pic:pic>
+                        <pic:nvPicPr>
+                          <pic:cNvPr id="0" name="Sala de bomba Sexto Piso.jpeg"/>
+                          <pic:cNvPicPr/>
+                        </pic:nvPicPr>
+                        <pic:blipFill>
+                          <a:blip r:embed="rId12"/>
+                          <a:stretch>
+                            <a:fillRect/>
+                          </a:stretch>
+                        </pic:blipFill>
+                        <pic:spPr>
+                          <a:xfrm>
+                            <a:off x="0" y="0"/>
+                            <a:ext cx="2606040" cy="3474720"/>
+                          </a:xfrm>
+                          <a:prstGeom prst="rect"/>
+                        </pic:spPr>
+                      </pic:pic>
+                    </a:graphicData>
+                  </a:graphic>
+                </wp:inline>
+              </w:drawing>
+            </w:r>
+          </w:p>
+          <w:p>
+            <w:pPr>
+              <w:jc w:val="center"/>
+            </w:pPr>
+            <w:r>
+              <w:rPr>
+                <w:b w:val="0"/>
+                <w:color w:val="505050"/>
+                <w:sz w:val="14"/>
+              </w:rPr>
+              <w:t>Sala de Bomba Sexto Piso</w:t>
+            </w:r>
+          </w:p>
+        </w:tc>
+      </w:tr>
+    </w:tbl>
     <w:p>
       <w:pPr>
-        <w:spacing w:after="40"/>
-        <w:jc w:val="center"/>
+        <w:spacing w:after="80"/>
       </w:pPr>
-      <w:r>
-        <w:drawing>
-          <wp:inline xmlns:a="http://schemas.openxmlformats.org/drawingml/2006/main" xmlns:pic="http://schemas.openxmlformats.org/drawingml/2006/picture">
-            <wp:extent cx="2880360" cy="3840480"/>
-            <wp:docPr id="1" name="Picture 1"/>
-            <wp:cNvGraphicFramePr>
-              <a:graphicFrameLocks noChangeAspect="1"/>
-            </wp:cNvGraphicFramePr>
-            <a:graphic>
-              <a:graphicData uri="http://schemas.openxmlformats.org/drawingml/2006/picture">
-                <pic:pic>
-                  <pic:nvPicPr>
-                    <pic:cNvPr id="0" name="Matriz Sanitaria.jpeg"/>
-                    <pic:cNvPicPr/>
-                  </pic:nvPicPr>
-                  <pic:blipFill>
-                    <a:blip r:embed="rId9"/>
-                    <a:stretch>
-                      <a:fillRect/>
-                    </a:stretch>
-                  </pic:blipFill>
-                  <pic:spPr>
-                    <a:xfrm>
-                      <a:off x="0" y="0"/>
-                      <a:ext cx="2880360" cy="3840480"/>
-                    </a:xfrm>
-                    <a:prstGeom prst="rect"/>
-                  </pic:spPr>
-                </pic:pic>
-              </a:graphicData>
-            </a:graphic>
-          </wp:inline>
-        </w:drawing>
-      </w:r>
-    </w:p>
-    <w:p>
-      <w:pPr>
-        <w:spacing w:after="160"/>
-        <w:jc w:val="center"/>
-      </w:pPr>
-      <w:r>
-        <w:rPr>
-          <w:b w:val="0"/>
-          <w:color w:val="505050"/>
-          <w:sz w:val="16"/>
-        </w:rPr>
-        <w:t>Medidor Principal Sanitaria — matriz de entrada</w:t>
-      </w:r>
-    </w:p>
-    <w:p>
-      <w:pPr>
-        <w:spacing w:after="40"/>
-        <w:jc w:val="center"/>
-      </w:pPr>
-      <w:r>
-        <w:drawing>
-          <wp:inline xmlns:a="http://schemas.openxmlformats.org/drawingml/2006/main" xmlns:pic="http://schemas.openxmlformats.org/drawingml/2006/picture">
-            <wp:extent cx="2880360" cy="3840480"/>
-            <wp:docPr id="2" name="Picture 2"/>
-            <wp:cNvGraphicFramePr>
-              <a:graphicFrameLocks noChangeAspect="1"/>
-            </wp:cNvGraphicFramePr>
-            <a:graphic>
-              <a:graphicData uri="http://schemas.openxmlformats.org/drawingml/2006/picture">
-                <pic:pic>
-                  <pic:nvPicPr>
-                    <pic:cNvPr id="0" name="Sala de bomba matriz principal.jpeg"/>
-                    <pic:cNvPicPr/>
-                  </pic:nvPicPr>
-                  <pic:blipFill>
-                    <a:blip r:embed="rId10"/>
-                    <a:stretch>
-                      <a:fillRect/>
-                    </a:stretch>
-                  </pic:blipFill>
-                  <pic:spPr>
-                    <a:xfrm>
-                      <a:off x="0" y="0"/>
-                      <a:ext cx="2880360" cy="3840480"/>
-                    </a:xfrm>
-                    <a:prstGeom prst="rect"/>
-                  </pic:spPr>
-                </pic:pic>
-              </a:graphicData>
-            </a:graphic>
-          </wp:inline>
-        </w:drawing>
-      </w:r>
-    </w:p>
-    <w:p>
-      <w:pPr>
-        <w:spacing w:after="160"/>
-        <w:jc w:val="center"/>
-      </w:pPr>
-      <w:r>
-        <w:rPr>
-          <w:b w:val="0"/>
-          <w:color w:val="505050"/>
-          <w:sz w:val="16"/>
-        </w:rPr>
-        <w:t>Sala de Bomba Principal (1er piso)</w:t>
-      </w:r>
-    </w:p>
-    <w:p>
-      <w:pPr>
-        <w:spacing w:after="40"/>
-        <w:jc w:val="center"/>
-      </w:pPr>
-      <w:r>
-        <w:drawing>
-          <wp:inline xmlns:a="http://schemas.openxmlformats.org/drawingml/2006/main" xmlns:pic="http://schemas.openxmlformats.org/drawingml/2006/picture">
-            <wp:extent cx="2880360" cy="3840480"/>
-            <wp:docPr id="3" name="Picture 3"/>
-            <wp:cNvGraphicFramePr>
-              <a:graphicFrameLocks noChangeAspect="1"/>
-            </wp:cNvGraphicFramePr>
-            <a:graphic>
-              <a:graphicData uri="http://schemas.openxmlformats.org/drawingml/2006/picture">
-                <pic:pic>
-                  <pic:nvPicPr>
-                    <pic:cNvPr id="0" name="Sala de bomna N°2.jpeg"/>
-                    <pic:cNvPicPr/>
-                  </pic:nvPicPr>
-                  <pic:blipFill>
-                    <a:blip r:embed="rId11"/>
-                    <a:stretch>
-                      <a:fillRect/>
-                    </a:stretch>
-                  </pic:blipFill>
-                  <pic:spPr>
-                    <a:xfrm>
-                      <a:off x="0" y="0"/>
-                      <a:ext cx="2880360" cy="3840480"/>
-                    </a:xfrm>
-                    <a:prstGeom prst="rect"/>
-                  </pic:spPr>
-                </pic:pic>
-              </a:graphicData>
-            </a:graphic>
-          </wp:inline>
-        </w:drawing>
-      </w:r>
-    </w:p>
-    <w:p>
-      <w:pPr>
-        <w:spacing w:after="160"/>
-        <w:jc w:val="center"/>
-      </w:pPr>
-      <w:r>
-        <w:rPr>
-          <w:b w:val="0"/>
-          <w:color w:val="505050"/>
-          <w:sz w:val="16"/>
-        </w:rPr>
-        <w:t>Sala de Bomba N°2 (1er piso)</w:t>
-      </w:r>
-    </w:p>
-    <w:p>
-      <w:pPr>
-        <w:spacing w:after="40"/>
-        <w:jc w:val="center"/>
-      </w:pPr>
-      <w:r>
-        <w:drawing>
-          <wp:inline xmlns:a="http://schemas.openxmlformats.org/drawingml/2006/main" xmlns:pic="http://schemas.openxmlformats.org/drawingml/2006/picture">
-            <wp:extent cx="2880360" cy="3840480"/>
-            <wp:docPr id="4" name="Picture 4"/>
-            <wp:cNvGraphicFramePr>
-              <a:graphicFrameLocks noChangeAspect="1"/>
-            </wp:cNvGraphicFramePr>
-            <a:graphic>
-              <a:graphicData uri="http://schemas.openxmlformats.org/drawingml/2006/picture">
-                <pic:pic>
-                  <pic:nvPicPr>
-                    <pic:cNvPr id="0" name="Sala de bomba Sexto Piso.jpeg"/>
-                    <pic:cNvPicPr/>
-                  </pic:nvPicPr>
-                  <pic:blipFill>
-                    <a:blip r:embed="rId12"/>
-                    <a:stretch>
-                      <a:fillRect/>
-                    </a:stretch>
-                  </pic:blipFill>
-                  <pic:spPr>
-                    <a:xfrm>
-                      <a:off x="0" y="0"/>
-                      <a:ext cx="2880360" cy="3840480"/>
-                    </a:xfrm>
-                    <a:prstGeom prst="rect"/>
-                  </pic:spPr>
-                </pic:pic>
-              </a:graphicData>
-            </a:graphic>
-          </wp:inline>
-        </w:drawing>
-      </w:r>
-    </w:p>
-    <w:p>
-      <w:pPr>
-        <w:spacing w:after="160"/>
-        <w:jc w:val="center"/>
-      </w:pPr>
-      <w:r>
-        <w:rPr>
-          <w:b w:val="0"/>
-          <w:color w:val="505050"/>
-          <w:sz w:val="16"/>
-        </w:rPr>
-        <w:t>Sala de Bomba Sexto Piso</w:t>
-      </w:r>
     </w:p>
     <w:p>
       <w:pPr>
@@ -4385,7 +4421,7 @@
           <w:color w:val="000000"/>
           <w:sz w:val="16"/>
         </w:rPr>
-        <w:t>Documento generado 20/10/2026 19:11 · WES · Clínica Bupa Antofagasta</w:t>
+        <w:t>Documento generado 20/10/2026 19:13 · WES · Clínica Bupa Antofagasta</w:t>
       </w:r>
     </w:p>
     <w:sectPr>

</xml_diff>